<commit_message>
docs: README reflects local/team modes, BGE-M3 embeddings and cron; anonymise manual docx
- Overview no longer claims 'no backend / fully offline'; describes local
  mode and the in-progress team mode
- Vector embedding section: provider auto-selection, incremental v6 cache,
  heading-based chunking (the old IndexedDB / LangChain claims were stale)
- New 'Automation (cron)' section (KR + EN)
- manual/*.docx: character names → 캐릭터A~J, Rembrandt → Strata Sync
- manual/manual_unpacked/ untracked (build intermediate, held real names)

Co-Authored-By: Claude Opus 5 <noreply@anthropic.com>
</commit_message>
<xml_diff>
--- a/manual/Graph RAG 데이터 정제 매뉴얼 v3.22.docx
+++ b/manual/Graph RAG 데이터 정제 매뉴얼 v3.22.docx
@@ -218,7 +218,7 @@
               <w:jc w:val="left"/>
             </w:pPr>
             <w:r>
-              <w:t xml:space="preserve">Rembrandt Map 또는 동등 Graph RAG 시스템</w:t>
+              <w:t xml:space="preserve">Strata Sync 또는 동등 Graph RAG 시스템</w:t>
             </w:r>
           </w:p>
         </w:tc>
@@ -2965,7 +2965,7 @@
         <w:pStyle w:val="BlockText"/>
       </w:pPr>
       <w:r>
-        <w:t xml:space="preserve">| 다이잔 | 100 | 85 | 60 |</w:t>
+        <w:t xml:space="preserve">| 캐릭터G | 100 | 85 | 60 |</w:t>
       </w:r>
     </w:p>
     <w:p>
@@ -3308,7 +3308,7 @@
         <w:pStyle w:val="BodyText"/>
       </w:pPr>
       <w:r>
-        <w:t xml:space="preserve">Rembrandt Map의 directVaultSearch는 [YYYY.MM.DD] 형식의 파일명을 감지하여 자연어 질문에서도 해당 파일을 직접 검색한다. TF-IDF를 통하지 않고 파일명 매칭으로 우선 처리되므로 날짜 기반 문서(피드백·회의록·보고서)는 아래 형식을 따를 때 검색 정확도가 크게 향상된다.</w:t>
+        <w:t xml:space="preserve">Strata Sync의 directVaultSearch는 [YYYY.MM.DD] 형식의 파일명을 감지하여 자연어 질문에서도 해당 파일을 직접 검색한다. TF-IDF를 통하지 않고 파일명 매칭으로 우선 처리되므로 날짜 기반 문서(피드백·회의록·보고서)는 아래 형식을 따를 때 검색 정확도가 크게 향상된다.</w:t>
       </w:r>
     </w:p>
     <w:p>
@@ -5294,7 +5294,7 @@
         <w:pStyle w:val="BlockText"/>
       </w:pPr>
       <w:r>
-        <w:t xml:space="preserve">'다이잔': ('06. 캐릭터 _ 다이잔_416014685', '다이잔'),</w:t>
+        <w:t xml:space="preserve">'캐릭터G': ('06. 캐릭터 _ 캐릭터G_416014685', '캐릭터G'),</w:t>
       </w:r>
     </w:p>
     <w:p>
@@ -5340,7 +5340,7 @@
         <w:rPr>
           <w:i/>
         </w:rPr>
-        <w:t>v1 버그: [[07. 캐릭터 _ 스칼렛_432514018|스칼렛]] 에서 '스칼렛' 키워드를 교체하면 → [[07. 캐릭터 _ [[07. 캐릭터 _ 스칼렛_432514018|스칼렛]]_432514018|스칼렛]] 처럼 중첩 링크가 생성되어 파일이 손상된다.</w:t>
+        <w:t>v1 버그: [[07. 캐릭터 _ 캐릭터A_432514018|캐릭터A]] 에서 '캐릭터A' 키워드를 교체하면 → [[07. 캐릭터 _ [[07. 캐릭터 _ 캐릭터A_432514018|캐릭터A]]_432514018|캐릭터A]] 처럼 중첩 링크가 생성되어 파일이 손상된다.</w:t>
       </w:r>
     </w:p>
     <w:p>
@@ -5695,23 +5695,23 @@
         <w:pStyle w:val="BlockText"/>
       </w:pPr>
       <w:r>
-        <w:t xml:space="preserve">  '스칼렛': ('07. 캐릭터_스칼렛_432514018', '스칼렛'),</w:t>
-      </w:r>
-    </w:p>
-    <w:p>
-      <w:pPr>
-        <w:pStyle w:val="BlockText"/>
-      </w:pPr>
-      <w:r>
-        <w:t xml:space="preserve">  'Scarlet': ('07. 캐릭터_스칼렛_432514018', '스칼렛'),</w:t>
-      </w:r>
-    </w:p>
-    <w:p>
-      <w:pPr>
-        <w:pStyle w:val="BlockText"/>
-      </w:pPr>
-      <w:r>
-        <w:t xml:space="preserve">  '붉은 악마': ('07. 캐릭터_스칼렛_432514018', '붉은 악마'),</w:t>
+        <w:t xml:space="preserve">  '캐릭터A': ('07. 캐릭터_캐릭터A_432514018', '캐릭터A'),</w:t>
+      </w:r>
+    </w:p>
+    <w:p>
+      <w:pPr>
+        <w:pStyle w:val="BlockText"/>
+      </w:pPr>
+      <w:r>
+        <w:t xml:space="preserve">  'Scarlet': ('07. 캐릭터_캐릭터A_432514018', '캐릭터A'),</w:t>
+      </w:r>
+    </w:p>
+    <w:p>
+      <w:pPr>
+        <w:pStyle w:val="BlockText"/>
+      </w:pPr>
+      <w:r>
+        <w:t xml:space="preserve">  '붉은 악마': ('07. 캐릭터_캐릭터A_432514018', '붉은 악마'),</w:t>
       </w:r>
     </w:p>
     <w:p>
@@ -6048,7 +6048,7 @@
         <w:pStyle w:val="BodyText"/>
       </w:pPr>
       <w:r>
-        <w:t xml:space="preserve">Rembrandt Map의 PPR 엔진은 순위별로 아래 글자 수만큼 문서를 읽는다. 이 예산 안에 핵심 정보가 들어 있어야 AI에게 전달된다.</w:t>
+        <w:t xml:space="preserve">Strata Sync의 PPR 엔진은 순위별로 아래 글자 수만큼 문서를 읽는다. 이 예산 안에 핵심 정보가 들어 있어야 AI에게 전달된다.</w:t>
       </w:r>
     </w:p>
     <w:tbl>
@@ -9833,7 +9833,7 @@
         <w:pStyle w:val="BodyText"/>
       </w:pPr>
       <w:r>
-        <w:t xml:space="preserve">inject_keywords.py 실행이나 파일 추가·수정 후 Rembrandt Map에서 별도로 인덱스를 갱신할 필요가 없다. 볼트를 재오픈하면 파일 mtime 기반 fingerprint를 자동 비교하여 변경이 있을 때만 재인덱싱한다.</w:t>
+        <w:t xml:space="preserve">inject_keywords.py 실행이나 파일 추가·수정 후 Strata Sync에서 별도로 인덱스를 갱신할 필요가 없다. 볼트를 재오픈하면 파일 mtime 기반 fingerprint를 자동 비교하여 변경이 있을 때만 재인덱싱한다.</w:t>
       </w:r>
     </w:p>
     <w:tbl>
@@ -11770,7 +11770,7 @@
         <w:tc>
           <w:p>
             <w:r>
-              <w:t xml:space="preserve">ProjectA_정례_20240215_월영.md</w:t>
+              <w:t xml:space="preserve">ProjectA_정례_20240215_캐릭터C.md</w:t>
             </w:r>
           </w:p>
         </w:tc>
@@ -11793,7 +11793,7 @@
         <w:tc>
           <w:p>
             <w:r>
-              <w:t xml:space="preserve">ProjectA_월영연출_250714.md</w:t>
+              <w:t xml:space="preserve">ProjectA_캐릭터C연출_250714.md</w:t>
             </w:r>
           </w:p>
         </w:tc>

</xml_diff>